<commit_message>
Locked Phase 4 plan: 7 steps from export reports through pilot launch
</commit_message>
<xml_diff>
--- a/Docs/Classroom-Connect-Project-Documentation-v4.docx
+++ b/Docs/Classroom-Connect-Project-Documentation-v4.docx
@@ -690,7 +690,7 @@
           <w:sz w:val="22"/>
           <w:szCs w:val="22"/>
         </w:rPr>
-        <w:t xml:space="preserve">Everything works without internet. This is not a feature that gets added later — it is the foundation of every architecture decision. SQLite for local storage, Socket.IO for local network communication, file-based lesson storage — all chosen specifically because they work offline.</w:t>
+        <w:t xml:space="preserve">Everything works without internet. This is not a feature that gets added later — it is the foundation of every architecture decision. SQLite for local storage, Socket.IO for local network communication, file-based lesson storage — all chosen specifically because they work offline. Every feature we build follows this rule: if it can’t work offline, we don’t build it — or we build it so the offline version works first and the online part is optional.</w:t>
       </w:r>
     </w:p>
     <w:p>
@@ -3680,25 +3680,25 @@
           <w:sz w:val="22"/>
           <w:szCs w:val="22"/>
         </w:rPr>
+        <w:t xml:space="preserve">Exportable reports as spreadsheet — Phase 4 Step 1 (next to build)</w:t>
+      </w:r>
+    </w:p>
+    <w:p>
+      <w:pPr>
+        <w:pStyle w:val="ListParagraph"/>
+        <w:numPr>
+          <w:ilvl w:val="0"/>
+          <w:numId w:val="3"/>
+        </w:numPr>
+        <w:spacing w:after="60"/>
+      </w:pPr>
+      <w:r>
+        <w:rPr>
+          <w:rFonts w:ascii="Arial" w:cs="Arial" w:eastAsia="Arial" w:hAnsi="Arial"/>
+          <w:sz w:val="22"/>
+          <w:szCs w:val="22"/>
+        </w:rPr>
         <w:t xml:space="preserve">Cloud sync postponed (can be added at any stage — see Section 7)</w:t>
-      </w:r>
-    </w:p>
-    <w:p>
-      <w:pPr>
-        <w:pStyle w:val="ListParagraph"/>
-        <w:numPr>
-          <w:ilvl w:val="0"/>
-          <w:numId w:val="3"/>
-        </w:numPr>
-        <w:spacing w:after="60"/>
-      </w:pPr>
-      <w:r>
-        <w:rPr>
-          <w:rFonts w:ascii="Arial" w:cs="Arial" w:eastAsia="Arial" w:hAnsi="Arial"/>
-          <w:sz w:val="22"/>
-          <w:szCs w:val="22"/>
-        </w:rPr>
-        <w:t xml:space="preserve">Export to PDF/CSV not yet implemented (Phase 4)</w:t>
       </w:r>
     </w:p>
     <w:p>
@@ -4359,7 +4359,7 @@
                 <w:sz w:val="20"/>
                 <w:szCs w:val="20"/>
               </w:rPr>
-              <w:t xml:space="preserve">Not Started</w:t>
+              <w:t xml:space="preserve">IN PROGRESS</w:t>
             </w:r>
           </w:p>
         </w:tc>
@@ -4386,7 +4386,7 @@
                 <w:sz w:val="20"/>
                 <w:szCs w:val="20"/>
               </w:rPr>
-              <w:t xml:space="preserve">QR code, Capacitor packaging, UI overhaul, testing</w:t>
+              <w:t xml:space="preserve">Export, QR code, question types, UI, packaging, pilot</w:t>
             </w:r>
           </w:p>
         </w:tc>
@@ -4411,8 +4411,28 @@
           <w:sz w:val="26"/>
           <w:szCs w:val="26"/>
         </w:rPr>
-        <w:t xml:space="preserve">5.1 Priority Order Going Forward</w:t>
-      </w:r>
+        <w:t xml:space="preserve">5.1 Phase 4 Step-by-Step Plan</w:t>
+      </w:r>
+    </w:p>
+    <w:p>
+      <w:pPr>
+        <w:spacing w:after="120"/>
+      </w:pPr>
+      <w:r>
+        <w:rPr>
+          <w:rFonts w:ascii="Arial" w:cs="Arial" w:eastAsia="Arial" w:hAnsi="Arial"/>
+          <w:b/>
+          <w:bCs/>
+          <w:sz w:val="22"/>
+          <w:szCs w:val="22"/>
+        </w:rPr>
+        <w:t xml:space="preserve">This is the locked plan. Steps are executed in order.</w:t>
+      </w:r>
+    </w:p>
+    <w:p>
+      <w:pPr>
+        <w:spacing w:after="80"/>
+      </w:pPr>
     </w:p>
     <w:p>
       <w:pPr>
@@ -4426,11 +4446,26 @@
       <w:r>
         <w:rPr>
           <w:rFonts w:ascii="Arial" w:cs="Arial" w:eastAsia="Arial" w:hAnsi="Arial"/>
-          <w:sz w:val="22"/>
-          <w:szCs w:val="22"/>
-        </w:rPr>
-        <w:t xml:space="preserve">Polish existing features — UI improvements, new question types, export features</w:t>
-      </w:r>
+          <w:b/>
+          <w:bCs/>
+          <w:sz w:val="22"/>
+          <w:szCs w:val="22"/>
+        </w:rPr>
+        <w:t xml:space="preserve">Exportable Reports — NOT STARTED. </w:t>
+      </w:r>
+      <w:r>
+        <w:rPr>
+          <w:rFonts w:ascii="Arial" w:cs="Arial" w:eastAsia="Arial" w:hAnsi="Arial"/>
+          <w:sz w:val="22"/>
+          <w:szCs w:val="22"/>
+        </w:rPr>
+        <w:t xml:space="preserve">Add download button on session history page. Exports session results as a spreadsheet (.xlsx) — student names, scores, per-question breakdown. Works fully offline (generated on the server, downloaded via browser). Makes the app immediately useful for real grading workflows.</w:t>
+      </w:r>
+    </w:p>
+    <w:p>
+      <w:pPr>
+        <w:spacing w:after="80"/>
+      </w:pPr>
     </w:p>
     <w:p>
       <w:pPr>
@@ -4444,11 +4479,26 @@
       <w:r>
         <w:rPr>
           <w:rFonts w:ascii="Arial" w:cs="Arial" w:eastAsia="Arial" w:hAnsi="Arial"/>
-          <w:sz w:val="22"/>
-          <w:szCs w:val="22"/>
-        </w:rPr>
-        <w:t xml:space="preserve">Test with real users — even a small group to discover what needs fixing</w:t>
-      </w:r>
+          <w:b/>
+          <w:bCs/>
+          <w:sz w:val="22"/>
+          <w:szCs w:val="22"/>
+        </w:rPr>
+        <w:t xml:space="preserve">QR Code for Student Joining — NOT STARTED. </w:t>
+      </w:r>
+      <w:r>
+        <w:rPr>
+          <w:rFonts w:ascii="Arial" w:cs="Arial" w:eastAsia="Arial" w:hAnsi="Arial"/>
+          <w:sz w:val="22"/>
+          <w:szCs w:val="22"/>
+        </w:rPr>
+        <w:t xml:space="preserve">Teacher dashboard displays a QR code that students scan to open the student page. Eliminates typing IP addresses. Already decided as the chosen method.</w:t>
+      </w:r>
+    </w:p>
+    <w:p>
+      <w:pPr>
+        <w:spacing w:after="80"/>
+      </w:pPr>
     </w:p>
     <w:p>
       <w:pPr>
@@ -4462,11 +4512,26 @@
       <w:r>
         <w:rPr>
           <w:rFonts w:ascii="Arial" w:cs="Arial" w:eastAsia="Arial" w:hAnsi="Arial"/>
-          <w:sz w:val="22"/>
-          <w:szCs w:val="22"/>
-        </w:rPr>
-        <w:t xml:space="preserve">Phase 4: QR code + Capacitor packaging — installable Android app with professional student onboarding</w:t>
-      </w:r>
+          <w:b/>
+          <w:bCs/>
+          <w:sz w:val="22"/>
+          <w:szCs w:val="22"/>
+        </w:rPr>
+        <w:t xml:space="preserve">Additional Question Types — NOT STARTED. </w:t>
+      </w:r>
+      <w:r>
+        <w:rPr>
+          <w:rFonts w:ascii="Arial" w:cs="Arial" w:eastAsia="Arial" w:hAnsi="Arial"/>
+          <w:sz w:val="22"/>
+          <w:szCs w:val="22"/>
+        </w:rPr>
+        <w:t xml:space="preserve">Add at least short answer and/or image-based questions to give teachers more flexibility in lesson design.</w:t>
+      </w:r>
+    </w:p>
+    <w:p>
+      <w:pPr>
+        <w:spacing w:after="80"/>
+      </w:pPr>
     </w:p>
     <w:p>
       <w:pPr>
@@ -4480,11 +4545,26 @@
       <w:r>
         <w:rPr>
           <w:rFonts w:ascii="Arial" w:cs="Arial" w:eastAsia="Arial" w:hAnsi="Arial"/>
-          <w:sz w:val="22"/>
-          <w:szCs w:val="22"/>
-        </w:rPr>
-        <w:t xml:space="preserve">Phase 4: UI/UX overhaul — brand identity, visual polish</w:t>
-      </w:r>
+          <w:b/>
+          <w:bCs/>
+          <w:sz w:val="22"/>
+          <w:szCs w:val="22"/>
+        </w:rPr>
+        <w:t xml:space="preserve">User Testing — NOT STARTED. </w:t>
+      </w:r>
+      <w:r>
+        <w:rPr>
+          <w:rFonts w:ascii="Arial" w:cs="Arial" w:eastAsia="Arial" w:hAnsi="Arial"/>
+          <w:sz w:val="22"/>
+          <w:szCs w:val="22"/>
+        </w:rPr>
+        <w:t xml:space="preserve">Pause building. Test with a small group of real users (even 2–3 friends or a colleague). Collect feedback. Fix what comes up before continuing.</w:t>
+      </w:r>
+    </w:p>
+    <w:p>
+      <w:pPr>
+        <w:spacing w:after="80"/>
+      </w:pPr>
     </w:p>
     <w:p>
       <w:pPr>
@@ -4498,10 +4578,86 @@
       <w:r>
         <w:rPr>
           <w:rFonts w:ascii="Arial" w:cs="Arial" w:eastAsia="Arial" w:hAnsi="Arial"/>
-          <w:sz w:val="22"/>
-          <w:szCs w:val="22"/>
-        </w:rPr>
-        <w:t xml:space="preserve">Cloud sync with Supabase — add whenever it becomes needed</w:t>
+          <w:b/>
+          <w:bCs/>
+          <w:sz w:val="22"/>
+          <w:szCs w:val="22"/>
+        </w:rPr>
+        <w:t xml:space="preserve">UI/UX Overhaul — NOT STARTED. </w:t>
+      </w:r>
+      <w:r>
+        <w:rPr>
+          <w:rFonts w:ascii="Arial" w:cs="Arial" w:eastAsia="Arial" w:hAnsi="Arial"/>
+          <w:sz w:val="22"/>
+          <w:szCs w:val="22"/>
+        </w:rPr>
+        <w:t xml:space="preserve">Complete visual redesign with real brand identity. Requires Moussa to collect visual references first (see Section 9).</w:t>
+      </w:r>
+    </w:p>
+    <w:p>
+      <w:pPr>
+        <w:spacing w:after="80"/>
+      </w:pPr>
+    </w:p>
+    <w:p>
+      <w:pPr>
+        <w:pStyle w:val="ListParagraph"/>
+        <w:numPr>
+          <w:ilvl w:val="0"/>
+          <w:numId w:val="4"/>
+        </w:numPr>
+        <w:spacing w:after="60"/>
+      </w:pPr>
+      <w:r>
+        <w:rPr>
+          <w:rFonts w:ascii="Arial" w:cs="Arial" w:eastAsia="Arial" w:hAnsi="Arial"/>
+          <w:b/>
+          <w:bCs/>
+          <w:sz w:val="22"/>
+          <w:szCs w:val="22"/>
+        </w:rPr>
+        <w:t xml:space="preserve">Capacitor Packaging — NOT STARTED. </w:t>
+      </w:r>
+      <w:r>
+        <w:rPr>
+          <w:rFonts w:ascii="Arial" w:cs="Arial" w:eastAsia="Arial" w:hAnsi="Arial"/>
+          <w:sz w:val="22"/>
+          <w:szCs w:val="22"/>
+        </w:rPr>
+        <w:t xml:space="preserve">Wrap the app into an installable Android app. Teacher taps an icon, everything runs. Android first, iOS if demand exists.</w:t>
+      </w:r>
+    </w:p>
+    <w:p>
+      <w:pPr>
+        <w:spacing w:after="80"/>
+      </w:pPr>
+    </w:p>
+    <w:p>
+      <w:pPr>
+        <w:pStyle w:val="ListParagraph"/>
+        <w:numPr>
+          <w:ilvl w:val="0"/>
+          <w:numId w:val="4"/>
+        </w:numPr>
+        <w:spacing w:after="60"/>
+      </w:pPr>
+      <w:r>
+        <w:rPr>
+          <w:rFonts w:ascii="Arial" w:cs="Arial" w:eastAsia="Arial" w:hAnsi="Arial"/>
+          <w:b/>
+          <w:bCs/>
+          <w:sz w:val="22"/>
+          <w:szCs w:val="22"/>
+        </w:rPr>
+        <w:t xml:space="preserve">Pilot Launch — NOT STARTED. </w:t>
+      </w:r>
+      <w:r>
+        <w:rPr>
+          <w:rFonts w:ascii="Arial" w:cs="Arial" w:eastAsia="Arial" w:hAnsi="Arial"/>
+          <w:sz w:val="22"/>
+          <w:szCs w:val="22"/>
+        </w:rPr>
+        <w:t xml:space="preserve">Put it in the hands of real teachers in a real classroom.</w:t>
       </w:r>
     </w:p>
     <w:p>
@@ -5459,7 +5615,7 @@
         <w:pStyle w:val="ListParagraph"/>
         <w:numPr>
           <w:ilvl w:val="0"/>
-          <w:numId w:val="2"/>
+          <w:numId w:val="7"/>
         </w:numPr>
         <w:spacing w:after="60"/>
       </w:pPr>
@@ -5477,7 +5633,7 @@
         <w:pStyle w:val="ListParagraph"/>
         <w:numPr>
           <w:ilvl w:val="0"/>
-          <w:numId w:val="2"/>
+          <w:numId w:val="7"/>
         </w:numPr>
         <w:spacing w:after="60"/>
       </w:pPr>
@@ -5495,7 +5651,7 @@
         <w:pStyle w:val="ListParagraph"/>
         <w:numPr>
           <w:ilvl w:val="0"/>
-          <w:numId w:val="2"/>
+          <w:numId w:val="7"/>
         </w:numPr>
         <w:spacing w:after="60"/>
       </w:pPr>
@@ -5634,7 +5790,7 @@
           <w:sz w:val="22"/>
           <w:szCs w:val="22"/>
         </w:rPr>
-        <w:t xml:space="preserve">The current UI is functional scaffolding. By Phase 4, Classroom Connect needs a complete visual overhaul with a real brand identity, custom icons, and polished design.</w:t>
+        <w:t xml:space="preserve">The current UI is functional scaffolding. By Phase 4 Step 5, Classroom Connect needs a complete visual overhaul with a real brand identity, custom icons, and polished design.</w:t>
       </w:r>
     </w:p>
     <w:p>
@@ -5752,7 +5908,7 @@
           <w:sz w:val="22"/>
           <w:szCs w:val="22"/>
         </w:rPr>
-        <w:t xml:space="preserve">When Phase 4 begins, prompt Moussa: “Before we start the UI overhaul, I need you to collect visual references. Screenshot apps, websites, or designs you think feel right for Classroom Connect — the colors, the mood, the energy, the style. Share those references with me and describe what you want.”</w:t>
+        <w:t xml:space="preserve">When Phase 4 Step 5 begins, prompt Moussa: “Before we start the UI overhaul, I need you to collect visual references. Screenshot apps, websites, or designs you think feel right for Classroom Connect — the colors, the mood, the energy, the style. Share those references with me and describe what you want.”</w:t>
       </w:r>
     </w:p>
     <w:p>
@@ -5779,6 +5935,19 @@
     </w:p>
     <w:p>
       <w:pPr>
+        <w:spacing w:after="120"/>
+      </w:pPr>
+      <w:r>
+        <w:rPr>
+          <w:rFonts w:ascii="Arial" w:cs="Arial" w:eastAsia="Arial" w:hAnsi="Arial"/>
+          <w:sz w:val="22"/>
+          <w:szCs w:val="22"/>
+        </w:rPr>
+        <w:t xml:space="preserve">Features beyond Phase 4, for future consideration:</w:t>
+      </w:r>
+    </w:p>
+    <w:p>
+      <w:pPr>
         <w:pStyle w:val="ListParagraph"/>
         <w:numPr>
           <w:ilvl w:val="0"/>
@@ -5792,7 +5961,7 @@
           <w:sz w:val="22"/>
           <w:szCs w:val="22"/>
         </w:rPr>
-        <w:t xml:space="preserve">Additional question types: matching, ordering, short answer, image-based</w:t>
+        <w:t xml:space="preserve">Gamification: badges, achievements, team competitions</w:t>
       </w:r>
     </w:p>
     <w:p>
@@ -5810,7 +5979,7 @@
           <w:sz w:val="22"/>
           <w:szCs w:val="22"/>
         </w:rPr>
-        <w:t xml:space="preserve">Gamification: badges, achievements, team competitions</w:t>
+        <w:t xml:space="preserve">Lesson sharing between teachers</w:t>
       </w:r>
     </w:p>
     <w:p>
@@ -5828,7 +5997,7 @@
           <w:sz w:val="22"/>
           <w:szCs w:val="22"/>
         </w:rPr>
-        <w:t xml:space="preserve">Lesson sharing between teachers</w:t>
+        <w:t xml:space="preserve">Admin dashboard for school-level reporting</w:t>
       </w:r>
     </w:p>
     <w:p>
@@ -5846,7 +6015,7 @@
           <w:sz w:val="22"/>
           <w:szCs w:val="22"/>
         </w:rPr>
-        <w:t xml:space="preserve">Admin dashboard for school-level reporting</w:t>
+        <w:t xml:space="preserve">Adaptive learning with AI-powered difficulty adjustment</w:t>
       </w:r>
     </w:p>
     <w:p>
@@ -5864,43 +6033,7 @@
           <w:sz w:val="22"/>
           <w:szCs w:val="22"/>
         </w:rPr>
-        <w:t xml:space="preserve">Adaptive learning with AI-powered difficulty adjustment</w:t>
-      </w:r>
-    </w:p>
-    <w:p>
-      <w:pPr>
-        <w:pStyle w:val="ListParagraph"/>
-        <w:numPr>
-          <w:ilvl w:val="0"/>
-          <w:numId w:val="3"/>
-        </w:numPr>
-        <w:spacing w:after="60"/>
-      </w:pPr>
-      <w:r>
-        <w:rPr>
-          <w:rFonts w:ascii="Arial" w:cs="Arial" w:eastAsia="Arial" w:hAnsi="Arial"/>
-          <w:sz w:val="22"/>
-          <w:szCs w:val="22"/>
-        </w:rPr>
         <w:t xml:space="preserve">Additional languages beyond French and English</w:t>
-      </w:r>
-    </w:p>
-    <w:p>
-      <w:pPr>
-        <w:pStyle w:val="ListParagraph"/>
-        <w:numPr>
-          <w:ilvl w:val="0"/>
-          <w:numId w:val="3"/>
-        </w:numPr>
-        <w:spacing w:after="60"/>
-      </w:pPr>
-      <w:r>
-        <w:rPr>
-          <w:rFonts w:ascii="Arial" w:cs="Arial" w:eastAsia="Arial" w:hAnsi="Arial"/>
-          <w:sz w:val="22"/>
-          <w:szCs w:val="22"/>
-        </w:rPr>
-        <w:t xml:space="preserve">Exportable reports (PDF/CSV)</w:t>
       </w:r>
     </w:p>
     <w:p>
@@ -6504,7 +6637,7 @@
                 <w:sz w:val="20"/>
                 <w:szCs w:val="20"/>
               </w:rPr>
-              <w:t xml:space="preserve">Planning session</w:t>
+              <w:t xml:space="preserve">Planning</w:t>
             </w:r>
           </w:p>
         </w:tc>
@@ -6587,7 +6720,7 @@
                 <w:sz w:val="20"/>
                 <w:szCs w:val="20"/>
               </w:rPr>
-              <w:t xml:space="preserve">Postponed cloud sync, chose QR code for student joining, clarified packaging strategy (Android first, teacher-only app, students use browser), set priority order</w:t>
+              <w:t xml:space="preserve">Postponed cloud sync, chose QR code, clarified packaging, locked Phase 4 plan (7 steps)</w:t>
             </w:r>
           </w:p>
         </w:tc>
@@ -6614,7 +6747,7 @@
                 <w:sz w:val="20"/>
                 <w:szCs w:val="20"/>
               </w:rPr>
-              <w:t xml:space="preserve">Polish + testing</w:t>
+              <w:t xml:space="preserve">Phase 4 Step 1</w:t>
             </w:r>
           </w:p>
         </w:tc>
@@ -7071,6 +7204,18 @@
       <w:lvlJc w:val="left"/>
       <w:pPr>
         <w:ind w:left="720" w:hanging="360"/>
+      </w:pPr>
+    </w:lvl>
+  </w:abstractNum>
+  <w:abstractNum w:abstractNumId="7" w15:restartNumberingAfterBreak="0">
+    <w:multiLevelType w:val="hybridMultilevel"/>
+    <w:lvl w:ilvl="0" w15:tentative="1">
+      <w:start w:val="1"/>
+      <w:numFmt w:val="decimal"/>
+      <w:lvlText w:val="Step %1:"/>
+      <w:lvlJc w:val="left"/>
+      <w:pPr>
+        <w:ind w:left="720" w:hanging="720"/>
       </w:pPr>
     </w:lvl>
   </w:abstractNum>
@@ -7093,18 +7238,24 @@
     </w:lvlOverride>
   </w:num>
   <w:num w:numId="4">
+    <w:abstractNumId w:val="7"/>
+    <w:lvlOverride w:ilvl="0">
+      <w:startOverride w:val="1"/>
+    </w:lvlOverride>
+  </w:num>
+  <w:num w:numId="5">
     <w:abstractNumId w:val="4"/>
     <w:lvlOverride w:ilvl="0">
       <w:startOverride w:val="1"/>
     </w:lvlOverride>
   </w:num>
-  <w:num w:numId="5">
+  <w:num w:numId="6">
     <w:abstractNumId w:val="5"/>
     <w:lvlOverride w:ilvl="0">
       <w:startOverride w:val="1"/>
     </w:lvlOverride>
   </w:num>
-  <w:num w:numId="6">
+  <w:num w:numId="7">
     <w:abstractNumId w:val="6"/>
     <w:lvlOverride w:ilvl="0">
       <w:startOverride w:val="1"/>

</xml_diff>